<commit_message>
Add support process documentation and flowchart for recruitment and IT management
</commit_message>
<xml_diff>
--- a/Support/Quy trình hỗ trợ.docx
+++ b/Support/Quy trình hỗ trợ.docx
@@ -562,6 +562,56 @@
     </w:p>
     <w:p>
       <w:pPr>
+        <w:ind w:left="720"/>
+        <w:rPr>
+          <w:sz w:val="26"/>
+          <w:szCs w:val="26"/>
+        </w:rPr>
+      </w:pPr>
+      <w:r>
+        <w:rPr>
+          <w:noProof/>
+        </w:rPr>
+        <w:lastRenderedPageBreak/>
+        <w:drawing>
+          <wp:inline distT="0" distB="0" distL="0" distR="0" wp14:anchorId="1A2D39B3" wp14:editId="7DF05862">
+            <wp:extent cx="5943600" cy="1837690"/>
+            <wp:effectExtent l="0" t="0" r="0" b="0"/>
+            <wp:docPr id="1606138842" name="Picture 1"/>
+            <wp:cNvGraphicFramePr>
+              <a:graphicFrameLocks xmlns:a="http://schemas.openxmlformats.org/drawingml/2006/main" noChangeAspect="1"/>
+            </wp:cNvGraphicFramePr>
+            <a:graphic xmlns:a="http://schemas.openxmlformats.org/drawingml/2006/main">
+              <a:graphicData uri="http://schemas.openxmlformats.org/drawingml/2006/picture">
+                <pic:pic xmlns:pic="http://schemas.openxmlformats.org/drawingml/2006/picture">
+                  <pic:nvPicPr>
+                    <pic:cNvPr id="1606138842" name=""/>
+                    <pic:cNvPicPr/>
+                  </pic:nvPicPr>
+                  <pic:blipFill>
+                    <a:blip r:embed="rId5"/>
+                    <a:stretch>
+                      <a:fillRect/>
+                    </a:stretch>
+                  </pic:blipFill>
+                  <pic:spPr>
+                    <a:xfrm>
+                      <a:off x="0" y="0"/>
+                      <a:ext cx="5943600" cy="1837690"/>
+                    </a:xfrm>
+                    <a:prstGeom prst="rect">
+                      <a:avLst/>
+                    </a:prstGeom>
+                  </pic:spPr>
+                </pic:pic>
+              </a:graphicData>
+            </a:graphic>
+          </wp:inline>
+        </w:drawing>
+      </w:r>
+    </w:p>
+    <w:p>
+      <w:pPr>
         <w:rPr>
           <w:sz w:val="26"/>
           <w:szCs w:val="26"/>
@@ -639,7 +689,6 @@
           <w:sz w:val="26"/>
           <w:szCs w:val="26"/>
         </w:rPr>
-        <w:lastRenderedPageBreak/>
         <w:t>Quản lý cửa hàng.</w:t>
       </w:r>
     </w:p>
@@ -849,16 +898,759 @@
           <w:sz w:val="26"/>
           <w:szCs w:val="26"/>
         </w:rPr>
-        <w:t xml:space="preserve">II. </w:t>
-      </w:r>
-      <w:r>
+        <w:t>II. Quản lý hệ thống công nghệ thông tin</w:t>
+      </w:r>
+    </w:p>
+    <w:p>
+      <w:pPr>
+        <w:rPr>
+          <w:sz w:val="26"/>
+          <w:szCs w:val="26"/>
+        </w:rPr>
+      </w:pPr>
+      <w:r>
+        <w:rPr>
+          <w:sz w:val="26"/>
+          <w:szCs w:val="26"/>
+        </w:rPr>
+        <w:t>1. Tác nhân</w:t>
+      </w:r>
+    </w:p>
+    <w:p>
+      <w:pPr>
+        <w:pStyle w:val="ListParagraph"/>
+        <w:numPr>
+          <w:ilvl w:val="0"/>
+          <w:numId w:val="6"/>
+        </w:numPr>
+        <w:rPr>
+          <w:sz w:val="26"/>
+          <w:szCs w:val="26"/>
+        </w:rPr>
+      </w:pPr>
+      <w:r>
+        <w:rPr>
+          <w:sz w:val="26"/>
+          <w:szCs w:val="26"/>
+        </w:rPr>
+        <w:t>Bộ phận công nghệ thông tin.</w:t>
+      </w:r>
+    </w:p>
+    <w:p>
+      <w:pPr>
+        <w:pStyle w:val="ListParagraph"/>
+        <w:numPr>
+          <w:ilvl w:val="0"/>
+          <w:numId w:val="6"/>
+        </w:numPr>
+        <w:rPr>
+          <w:sz w:val="26"/>
+          <w:szCs w:val="26"/>
+        </w:rPr>
+      </w:pPr>
+      <w:r>
+        <w:rPr>
+          <w:sz w:val="26"/>
+          <w:szCs w:val="26"/>
+        </w:rPr>
+        <w:t>Nhà cung cấp phần mềm và thiết bị.</w:t>
+      </w:r>
+    </w:p>
+    <w:p>
+      <w:pPr>
+        <w:pStyle w:val="ListParagraph"/>
+        <w:numPr>
+          <w:ilvl w:val="0"/>
+          <w:numId w:val="6"/>
+        </w:numPr>
+        <w:rPr>
+          <w:sz w:val="26"/>
+          <w:szCs w:val="26"/>
+        </w:rPr>
+      </w:pPr>
+      <w:r>
+        <w:rPr>
+          <w:sz w:val="26"/>
+          <w:szCs w:val="26"/>
+        </w:rPr>
+        <w:t>Nhân viên cửa hàng.</w:t>
+      </w:r>
+    </w:p>
+    <w:p>
+      <w:pPr>
+        <w:pStyle w:val="ListParagraph"/>
+        <w:numPr>
+          <w:ilvl w:val="0"/>
+          <w:numId w:val="6"/>
+        </w:numPr>
+        <w:rPr>
+          <w:sz w:val="26"/>
+          <w:szCs w:val="26"/>
+        </w:rPr>
+      </w:pPr>
+      <w:r>
+        <w:rPr>
+          <w:sz w:val="26"/>
+          <w:szCs w:val="26"/>
+        </w:rPr>
+        <w:t>Quản lý cửa hàng.</w:t>
+      </w:r>
+    </w:p>
+    <w:p>
+      <w:pPr>
+        <w:pStyle w:val="ListParagraph"/>
+        <w:numPr>
+          <w:ilvl w:val="0"/>
+          <w:numId w:val="6"/>
+        </w:numPr>
+        <w:rPr>
+          <w:sz w:val="26"/>
+          <w:szCs w:val="26"/>
+        </w:rPr>
+      </w:pPr>
+      <w:r>
+        <w:rPr>
+          <w:sz w:val="26"/>
+          <w:szCs w:val="26"/>
+        </w:rPr>
+        <w:t>Bộ phận tài chính.</w:t>
+      </w:r>
+    </w:p>
+    <w:p>
+      <w:pPr>
+        <w:pStyle w:val="ListParagraph"/>
+        <w:numPr>
+          <w:ilvl w:val="0"/>
+          <w:numId w:val="6"/>
+        </w:numPr>
+        <w:rPr>
+          <w:sz w:val="26"/>
+          <w:szCs w:val="26"/>
+        </w:rPr>
+      </w:pPr>
+      <w:r>
+        <w:rPr>
+          <w:sz w:val="26"/>
+          <w:szCs w:val="26"/>
+        </w:rPr>
+        <w:t>Bộ phận vận hành.</w:t>
+      </w:r>
+    </w:p>
+    <w:p>
+      <w:pPr>
+        <w:pStyle w:val="ListParagraph"/>
+        <w:numPr>
+          <w:ilvl w:val="0"/>
+          <w:numId w:val="6"/>
+        </w:numPr>
+        <w:rPr>
+          <w:sz w:val="26"/>
+          <w:szCs w:val="26"/>
+        </w:rPr>
+      </w:pPr>
+      <w:r>
+        <w:rPr>
+          <w:sz w:val="26"/>
+          <w:szCs w:val="26"/>
+        </w:rPr>
+        <w:t>Bộ phận bảo mật thông tin.</w:t>
+      </w:r>
+    </w:p>
+    <w:p>
+      <w:pPr>
+        <w:rPr>
+          <w:sz w:val="26"/>
+          <w:szCs w:val="26"/>
+        </w:rPr>
+      </w:pPr>
+      <w:r>
+        <w:rPr>
+          <w:sz w:val="26"/>
+          <w:szCs w:val="26"/>
+        </w:rPr>
+        <w:lastRenderedPageBreak/>
+        <w:t>2. Các bước thực hiện</w:t>
+      </w:r>
+    </w:p>
+    <w:p>
+      <w:pPr>
+        <w:rPr>
+          <w:sz w:val="26"/>
+          <w:szCs w:val="26"/>
+        </w:rPr>
+      </w:pPr>
+      <w:r>
+        <w:rPr>
+          <w:sz w:val="26"/>
+          <w:szCs w:val="26"/>
+        </w:rPr>
+        <w:tab/>
+        <w:t xml:space="preserve">S1: </w:t>
+      </w:r>
+      <w:r>
+        <w:rPr>
+          <w:sz w:val="26"/>
+          <w:szCs w:val="26"/>
+        </w:rPr>
+        <w:t>Tiếp nhận nhu cầu hoặc yêu cầu hỗ trợ từ người sử dụng.</w:t>
+      </w:r>
+    </w:p>
+    <w:p>
+      <w:pPr>
+        <w:ind w:firstLine="720"/>
+        <w:rPr>
+          <w:sz w:val="26"/>
+          <w:szCs w:val="26"/>
+        </w:rPr>
+      </w:pPr>
+      <w:r>
+        <w:rPr>
+          <w:sz w:val="26"/>
+          <w:szCs w:val="26"/>
+        </w:rPr>
+        <w:t xml:space="preserve">S2: </w:t>
+      </w:r>
+      <w:r>
+        <w:rPr>
+          <w:sz w:val="26"/>
+          <w:szCs w:val="26"/>
+        </w:rPr>
+        <w:t>Ghi nhận yêu cầu trên hệ thống hỗ trợ.</w:t>
+      </w:r>
+    </w:p>
+    <w:p>
+      <w:pPr>
+        <w:ind w:firstLine="720"/>
+        <w:rPr>
+          <w:sz w:val="26"/>
+          <w:szCs w:val="26"/>
+        </w:rPr>
+      </w:pPr>
+      <w:r>
+        <w:rPr>
+          <w:sz w:val="26"/>
+          <w:szCs w:val="26"/>
+        </w:rPr>
+        <w:t xml:space="preserve">S3: </w:t>
+      </w:r>
+      <w:r>
+        <w:rPr>
+          <w:sz w:val="26"/>
+          <w:szCs w:val="26"/>
+        </w:rPr>
+        <w:t>Phân loại mức độ ảnh hưởng và mức độ ưu tiên.</w:t>
+      </w:r>
+    </w:p>
+    <w:p>
+      <w:pPr>
+        <w:ind w:firstLine="720"/>
+        <w:rPr>
+          <w:sz w:val="26"/>
+          <w:szCs w:val="26"/>
+        </w:rPr>
+      </w:pPr>
+      <w:r>
+        <w:rPr>
+          <w:sz w:val="26"/>
+          <w:szCs w:val="26"/>
+        </w:rPr>
+        <w:t xml:space="preserve">S4: </w:t>
+      </w:r>
+      <w:r>
+        <w:rPr>
+          <w:sz w:val="26"/>
+          <w:szCs w:val="26"/>
+        </w:rPr>
+        <w:t>Kiểm tra hệ thống POS, mạng, máy in, thiết bị hoặc phần mềm.</w:t>
+      </w:r>
+    </w:p>
+    <w:p>
+      <w:pPr>
+        <w:ind w:firstLine="720"/>
+        <w:rPr>
+          <w:sz w:val="26"/>
+          <w:szCs w:val="26"/>
+        </w:rPr>
+      </w:pPr>
+      <w:r>
+        <w:rPr>
+          <w:sz w:val="26"/>
+          <w:szCs w:val="26"/>
+        </w:rPr>
+        <w:t xml:space="preserve">S5: </w:t>
+      </w:r>
+      <w:r>
+        <w:rPr>
+          <w:sz w:val="26"/>
+          <w:szCs w:val="26"/>
+        </w:rPr>
+        <w:t>Xác định nguyên nhân sự cố.</w:t>
+      </w:r>
+    </w:p>
+    <w:p>
+      <w:pPr>
+        <w:ind w:firstLine="720"/>
+        <w:rPr>
+          <w:sz w:val="26"/>
+          <w:szCs w:val="26"/>
+        </w:rPr>
+      </w:pPr>
+      <w:r>
+        <w:rPr>
+          <w:sz w:val="26"/>
+          <w:szCs w:val="26"/>
+        </w:rPr>
+        <w:t xml:space="preserve">S6: </w:t>
+      </w:r>
+      <w:r>
+        <w:rPr>
+          <w:sz w:val="26"/>
+          <w:szCs w:val="26"/>
+        </w:rPr>
+        <w:t>Thực hiện sửa chữa, cấu hình hoặc thay thế thiết bị.</w:t>
+      </w:r>
+    </w:p>
+    <w:p>
+      <w:pPr>
+        <w:ind w:firstLine="720"/>
+        <w:rPr>
+          <w:sz w:val="26"/>
+          <w:szCs w:val="26"/>
+        </w:rPr>
+      </w:pPr>
+      <w:r>
+        <w:rPr>
+          <w:sz w:val="26"/>
+          <w:szCs w:val="26"/>
+        </w:rPr>
+        <w:t xml:space="preserve">S7: </w:t>
+      </w:r>
+      <w:r>
+        <w:rPr>
+          <w:sz w:val="26"/>
+          <w:szCs w:val="26"/>
+        </w:rPr>
+        <w:t>Kiểm tra hệ thống sau khi xử lý.</w:t>
+      </w:r>
+    </w:p>
+    <w:p>
+      <w:pPr>
+        <w:ind w:firstLine="720"/>
+        <w:rPr>
+          <w:sz w:val="26"/>
+          <w:szCs w:val="26"/>
+        </w:rPr>
+      </w:pPr>
+      <w:r>
+        <w:rPr>
+          <w:sz w:val="26"/>
+          <w:szCs w:val="26"/>
+        </w:rPr>
+        <w:t xml:space="preserve">S8: </w:t>
+      </w:r>
+      <w:r>
+        <w:rPr>
+          <w:sz w:val="26"/>
+          <w:szCs w:val="26"/>
+        </w:rPr>
+        <w:t>Người sử dụng xác nhận hệ thống hoạt động bình thường.</w:t>
+      </w:r>
+    </w:p>
+    <w:p>
+      <w:pPr>
+        <w:ind w:firstLine="720"/>
+        <w:rPr>
+          <w:sz w:val="26"/>
+          <w:szCs w:val="26"/>
+        </w:rPr>
+      </w:pPr>
+      <w:r>
+        <w:rPr>
+          <w:sz w:val="26"/>
+          <w:szCs w:val="26"/>
+        </w:rPr>
+        <w:t xml:space="preserve">S9: </w:t>
+      </w:r>
+      <w:r>
+        <w:rPr>
+          <w:sz w:val="26"/>
+          <w:szCs w:val="26"/>
+        </w:rPr>
+        <w:t>Đóng yêu cầu và lưu lại lịch sử xử lý.</w:t>
+      </w:r>
+    </w:p>
+    <w:p>
+      <w:pPr>
+        <w:ind w:firstLine="720"/>
+        <w:rPr>
+          <w:sz w:val="26"/>
+          <w:szCs w:val="26"/>
+        </w:rPr>
+      </w:pPr>
+      <w:r>
+        <w:rPr>
+          <w:sz w:val="26"/>
+          <w:szCs w:val="26"/>
+        </w:rPr>
+        <w:t xml:space="preserve">S10: </w:t>
+      </w:r>
+      <w:r>
+        <w:rPr>
+          <w:sz w:val="26"/>
+          <w:szCs w:val="26"/>
+        </w:rPr>
+        <w:t>Phân tích sự cố để đề xuất biện pháp phòng ngừa.</w:t>
+      </w:r>
+    </w:p>
+    <w:p>
+      <w:pPr>
+        <w:ind w:firstLine="720"/>
+        <w:rPr>
+          <w:sz w:val="26"/>
+          <w:szCs w:val="26"/>
+        </w:rPr>
+      </w:pPr>
+      <w:r>
+        <w:rPr>
+          <w:sz w:val="26"/>
+          <w:szCs w:val="26"/>
+        </w:rPr>
+        <w:t xml:space="preserve">S11: </w:t>
+      </w:r>
+      <w:r>
+        <w:rPr>
+          <w:sz w:val="26"/>
+          <w:szCs w:val="26"/>
+        </w:rPr>
+        <w:t>Thực hiện sao lưu, cập nhật và bảo vệ dữ liệu định kỳ.</w:t>
+      </w:r>
+    </w:p>
+    <w:p>
+      <w:pPr>
+        <w:ind w:firstLine="720"/>
+        <w:rPr>
+          <w:sz w:val="26"/>
+          <w:szCs w:val="26"/>
+        </w:rPr>
+      </w:pPr>
+      <w:r>
+        <w:rPr>
+          <w:sz w:val="26"/>
+          <w:szCs w:val="26"/>
+        </w:rPr>
+        <w:drawing>
+          <wp:inline distT="0" distB="0" distL="0" distR="0" wp14:anchorId="142C35EA" wp14:editId="37DF0F0C">
+            <wp:extent cx="5943600" cy="1645285"/>
+            <wp:effectExtent l="0" t="0" r="0" b="0"/>
+            <wp:docPr id="573327247" name="Picture 1"/>
+            <wp:cNvGraphicFramePr>
+              <a:graphicFrameLocks xmlns:a="http://schemas.openxmlformats.org/drawingml/2006/main" noChangeAspect="1"/>
+            </wp:cNvGraphicFramePr>
+            <a:graphic xmlns:a="http://schemas.openxmlformats.org/drawingml/2006/main">
+              <a:graphicData uri="http://schemas.openxmlformats.org/drawingml/2006/picture">
+                <pic:pic xmlns:pic="http://schemas.openxmlformats.org/drawingml/2006/picture">
+                  <pic:nvPicPr>
+                    <pic:cNvPr id="573327247" name=""/>
+                    <pic:cNvPicPr/>
+                  </pic:nvPicPr>
+                  <pic:blipFill>
+                    <a:blip r:embed="rId6"/>
+                    <a:stretch>
+                      <a:fillRect/>
+                    </a:stretch>
+                  </pic:blipFill>
+                  <pic:spPr>
+                    <a:xfrm>
+                      <a:off x="0" y="0"/>
+                      <a:ext cx="5943600" cy="1645285"/>
+                    </a:xfrm>
+                    <a:prstGeom prst="rect">
+                      <a:avLst/>
+                    </a:prstGeom>
+                  </pic:spPr>
+                </pic:pic>
+              </a:graphicData>
+            </a:graphic>
+          </wp:inline>
+        </w:drawing>
+      </w:r>
+    </w:p>
+    <w:p>
+      <w:pPr>
+        <w:rPr>
+          <w:sz w:val="26"/>
+          <w:szCs w:val="26"/>
+        </w:rPr>
+      </w:pPr>
+      <w:r>
+        <w:rPr>
+          <w:sz w:val="26"/>
+          <w:szCs w:val="26"/>
+        </w:rPr>
+        <w:t>3. Đối tượng khách hàng</w:t>
+      </w:r>
+    </w:p>
+    <w:p>
+      <w:pPr>
+        <w:pStyle w:val="ListParagraph"/>
+        <w:numPr>
+          <w:ilvl w:val="0"/>
+          <w:numId w:val="7"/>
+        </w:numPr>
+        <w:rPr>
+          <w:sz w:val="26"/>
+          <w:szCs w:val="26"/>
+        </w:rPr>
+      </w:pPr>
+      <w:r>
+        <w:rPr>
+          <w:sz w:val="26"/>
+          <w:szCs w:val="26"/>
+        </w:rPr>
+        <w:t>Nhân viên và quản lý cửa hàng.</w:t>
+      </w:r>
+    </w:p>
+    <w:p>
+      <w:pPr>
+        <w:pStyle w:val="ListParagraph"/>
+        <w:numPr>
+          <w:ilvl w:val="0"/>
+          <w:numId w:val="7"/>
+        </w:numPr>
+        <w:rPr>
+          <w:sz w:val="26"/>
+          <w:szCs w:val="26"/>
+        </w:rPr>
+      </w:pPr>
+      <w:r>
+        <w:rPr>
+          <w:sz w:val="26"/>
+          <w:szCs w:val="26"/>
+        </w:rPr>
+        <w:t>Các phòng ban.</w:t>
+      </w:r>
+    </w:p>
+    <w:p>
+      <w:pPr>
+        <w:pStyle w:val="ListParagraph"/>
+        <w:numPr>
+          <w:ilvl w:val="0"/>
+          <w:numId w:val="7"/>
+        </w:numPr>
+        <w:rPr>
+          <w:sz w:val="26"/>
+          <w:szCs w:val="26"/>
+        </w:rPr>
+      </w:pPr>
+      <w:r>
+        <w:rPr>
+          <w:sz w:val="26"/>
+          <w:szCs w:val="26"/>
+        </w:rPr>
+        <w:t>Khách hàng sử dụng website hoặc ứng dụng.</w:t>
+      </w:r>
+    </w:p>
+    <w:p>
+      <w:pPr>
+        <w:pStyle w:val="ListParagraph"/>
+        <w:numPr>
+          <w:ilvl w:val="0"/>
+          <w:numId w:val="7"/>
+        </w:numPr>
+        <w:rPr>
+          <w:sz w:val="26"/>
+          <w:szCs w:val="26"/>
+        </w:rPr>
+      </w:pPr>
+      <w:r>
+        <w:rPr>
+          <w:sz w:val="26"/>
+          <w:szCs w:val="26"/>
+        </w:rPr>
+        <w:t>Ban lãnh đạo cần dữ liệu báo cáo.</w:t>
+      </w:r>
+    </w:p>
+    <w:p>
+      <w:pPr>
+        <w:rPr>
+          <w:sz w:val="26"/>
+          <w:szCs w:val="26"/>
+        </w:rPr>
+      </w:pPr>
+      <w:r>
+        <w:rPr>
+          <w:sz w:val="26"/>
+          <w:szCs w:val="26"/>
+        </w:rPr>
+        <w:t>4. Các kết quả có thể xảy ra</w:t>
+      </w:r>
+    </w:p>
+    <w:p>
+      <w:pPr>
+        <w:pStyle w:val="ListParagraph"/>
+        <w:numPr>
+          <w:ilvl w:val="0"/>
+          <w:numId w:val="8"/>
+        </w:numPr>
+        <w:rPr>
+          <w:sz w:val="26"/>
+          <w:szCs w:val="26"/>
+        </w:rPr>
+      </w:pPr>
+      <w:r>
+        <w:rPr>
+          <w:sz w:val="26"/>
+          <w:szCs w:val="26"/>
+        </w:rPr>
+        <w:t>Sự cố được xử lý hoàn toàn.</w:t>
+      </w:r>
+    </w:p>
+    <w:p>
+      <w:pPr>
+        <w:pStyle w:val="ListParagraph"/>
+        <w:numPr>
+          <w:ilvl w:val="0"/>
+          <w:numId w:val="8"/>
+        </w:numPr>
+        <w:rPr>
+          <w:sz w:val="26"/>
+          <w:szCs w:val="26"/>
+        </w:rPr>
+      </w:pPr>
+      <w:r>
+        <w:rPr>
+          <w:sz w:val="26"/>
+          <w:szCs w:val="26"/>
+        </w:rPr>
+        <w:t>Hệ thống được khôi phục tạm thời.</w:t>
+      </w:r>
+    </w:p>
+    <w:p>
+      <w:pPr>
+        <w:pStyle w:val="ListParagraph"/>
+        <w:numPr>
+          <w:ilvl w:val="0"/>
+          <w:numId w:val="8"/>
+        </w:numPr>
+        <w:rPr>
+          <w:sz w:val="26"/>
+          <w:szCs w:val="26"/>
+        </w:rPr>
+      </w:pPr>
+      <w:r>
+        <w:rPr>
+          <w:sz w:val="26"/>
+          <w:szCs w:val="26"/>
+        </w:rPr>
+        <w:lastRenderedPageBreak/>
+        <w:t>Thiết bị cần được thay thế.</w:t>
+      </w:r>
+    </w:p>
+    <w:p>
+      <w:pPr>
+        <w:pStyle w:val="ListParagraph"/>
+        <w:numPr>
+          <w:ilvl w:val="0"/>
+          <w:numId w:val="8"/>
+        </w:numPr>
+        <w:rPr>
+          <w:sz w:val="26"/>
+          <w:szCs w:val="26"/>
+        </w:rPr>
+      </w:pPr>
+      <w:r>
+        <w:rPr>
+          <w:sz w:val="26"/>
+          <w:szCs w:val="26"/>
+        </w:rPr>
+        <w:t>Sự cố được chuyển cho nhà cung cấp xử lý.</w:t>
+      </w:r>
+    </w:p>
+    <w:p>
+      <w:pPr>
+        <w:pStyle w:val="ListParagraph"/>
+        <w:numPr>
+          <w:ilvl w:val="0"/>
+          <w:numId w:val="8"/>
+        </w:numPr>
+        <w:rPr>
+          <w:sz w:val="26"/>
+          <w:szCs w:val="26"/>
+        </w:rPr>
+      </w:pPr>
+      <w:r>
+        <w:rPr>
+          <w:sz w:val="26"/>
+          <w:szCs w:val="26"/>
+        </w:rPr>
+        <w:t>Hệ thống tiếp tục gián đoạn.</w:t>
+      </w:r>
+    </w:p>
+    <w:p>
+      <w:pPr>
+        <w:pStyle w:val="ListParagraph"/>
+        <w:numPr>
+          <w:ilvl w:val="0"/>
+          <w:numId w:val="8"/>
+        </w:numPr>
+        <w:rPr>
+          <w:sz w:val="26"/>
+          <w:szCs w:val="26"/>
+        </w:rPr>
+      </w:pPr>
+      <w:r>
+        <w:rPr>
+          <w:sz w:val="26"/>
+          <w:szCs w:val="26"/>
+        </w:rPr>
+        <w:t>Dữ liệu được khôi phục hoặc có nguy cơ bị mất.</w:t>
+      </w:r>
+    </w:p>
+    <w:p>
+      <w:pPr>
+        <w:pStyle w:val="ListParagraph"/>
+        <w:numPr>
+          <w:ilvl w:val="0"/>
+          <w:numId w:val="8"/>
+        </w:numPr>
+        <w:rPr>
+          <w:sz w:val="26"/>
+          <w:szCs w:val="26"/>
+        </w:rPr>
+      </w:pPr>
+      <w:r>
+        <w:rPr>
+          <w:sz w:val="26"/>
+          <w:szCs w:val="26"/>
+        </w:rPr>
+        <w:t>Yêu cầu cải tiến hệ thống được phê duyệt.</w:t>
+      </w:r>
+    </w:p>
+    <w:p>
+      <w:pPr>
+        <w:rPr>
+          <w:sz w:val="26"/>
+          <w:szCs w:val="26"/>
+        </w:rPr>
+      </w:pPr>
+    </w:p>
+    <w:p>
+      <w:pPr>
         <w:rPr>
           <w:b/>
           <w:bCs/>
           <w:sz w:val="26"/>
           <w:szCs w:val="26"/>
         </w:rPr>
-        <w:t>Quản lý hệ thống công nghệ thông tin</w:t>
+      </w:pPr>
+      <w:r>
+        <w:rPr>
+          <w:b/>
+          <w:bCs/>
+          <w:sz w:val="26"/>
+          <w:szCs w:val="26"/>
+        </w:rPr>
+        <w:t>III. Quản lý tài chính, kế toán và đối soát doanh thu</w:t>
       </w:r>
     </w:p>
     <w:p>
@@ -881,67 +1673,27 @@
         <w:pStyle w:val="ListParagraph"/>
         <w:numPr>
           <w:ilvl w:val="0"/>
-          <w:numId w:val="6"/>
-        </w:numPr>
-        <w:rPr>
-          <w:sz w:val="26"/>
-          <w:szCs w:val="26"/>
-        </w:rPr>
-      </w:pPr>
-      <w:r>
-        <w:rPr>
-          <w:sz w:val="26"/>
-          <w:szCs w:val="26"/>
-        </w:rPr>
-        <w:t>Bộ phận công nghệ thông tin.</w:t>
-      </w:r>
-    </w:p>
-    <w:p>
-      <w:pPr>
-        <w:pStyle w:val="ListParagraph"/>
-        <w:numPr>
-          <w:ilvl w:val="0"/>
-          <w:numId w:val="6"/>
-        </w:numPr>
-        <w:rPr>
-          <w:sz w:val="26"/>
-          <w:szCs w:val="26"/>
-        </w:rPr>
-      </w:pPr>
-      <w:r>
-        <w:rPr>
-          <w:sz w:val="26"/>
-          <w:szCs w:val="26"/>
-        </w:rPr>
-        <w:t>Nhà cung cấp phần mềm và thiết bị.</w:t>
-      </w:r>
-    </w:p>
-    <w:p>
-      <w:pPr>
-        <w:pStyle w:val="ListParagraph"/>
-        <w:numPr>
-          <w:ilvl w:val="0"/>
-          <w:numId w:val="6"/>
-        </w:numPr>
-        <w:rPr>
-          <w:sz w:val="26"/>
-          <w:szCs w:val="26"/>
-        </w:rPr>
-      </w:pPr>
-      <w:r>
-        <w:rPr>
-          <w:sz w:val="26"/>
-          <w:szCs w:val="26"/>
-        </w:rPr>
-        <w:t>Nhân viên cửa hàng.</w:t>
-      </w:r>
-    </w:p>
-    <w:p>
-      <w:pPr>
-        <w:pStyle w:val="ListParagraph"/>
-        <w:numPr>
-          <w:ilvl w:val="0"/>
-          <w:numId w:val="6"/>
+          <w:numId w:val="10"/>
+        </w:numPr>
+        <w:rPr>
+          <w:sz w:val="26"/>
+          <w:szCs w:val="26"/>
+        </w:rPr>
+      </w:pPr>
+      <w:r>
+        <w:rPr>
+          <w:sz w:val="26"/>
+          <w:szCs w:val="26"/>
+        </w:rPr>
+        <w:t>Nhân viên thu ngân.</w:t>
+      </w:r>
+    </w:p>
+    <w:p>
+      <w:pPr>
+        <w:pStyle w:val="ListParagraph"/>
+        <w:numPr>
+          <w:ilvl w:val="0"/>
+          <w:numId w:val="10"/>
         </w:numPr>
         <w:rPr>
           <w:sz w:val="26"/>
@@ -961,7 +1713,27 @@
         <w:pStyle w:val="ListParagraph"/>
         <w:numPr>
           <w:ilvl w:val="0"/>
-          <w:numId w:val="6"/>
+          <w:numId w:val="10"/>
+        </w:numPr>
+        <w:rPr>
+          <w:sz w:val="26"/>
+          <w:szCs w:val="26"/>
+        </w:rPr>
+      </w:pPr>
+      <w:r>
+        <w:rPr>
+          <w:sz w:val="26"/>
+          <w:szCs w:val="26"/>
+        </w:rPr>
+        <w:t>Bộ phận kế toán.</w:t>
+      </w:r>
+    </w:p>
+    <w:p>
+      <w:pPr>
+        <w:pStyle w:val="ListParagraph"/>
+        <w:numPr>
+          <w:ilvl w:val="0"/>
+          <w:numId w:val="10"/>
         </w:numPr>
         <w:rPr>
           <w:sz w:val="26"/>
@@ -981,54 +1753,121 @@
         <w:pStyle w:val="ListParagraph"/>
         <w:numPr>
           <w:ilvl w:val="0"/>
-          <w:numId w:val="6"/>
-        </w:numPr>
-        <w:rPr>
-          <w:sz w:val="26"/>
-          <w:szCs w:val="26"/>
-        </w:rPr>
-      </w:pPr>
-      <w:r>
-        <w:rPr>
-          <w:sz w:val="26"/>
-          <w:szCs w:val="26"/>
-        </w:rPr>
-        <w:t>Bộ phận vận hành.</w:t>
-      </w:r>
-    </w:p>
-    <w:p>
-      <w:pPr>
-        <w:pStyle w:val="ListParagraph"/>
-        <w:numPr>
-          <w:ilvl w:val="0"/>
-          <w:numId w:val="6"/>
-        </w:numPr>
-        <w:rPr>
-          <w:sz w:val="26"/>
-          <w:szCs w:val="26"/>
-        </w:rPr>
-      </w:pPr>
-      <w:r>
-        <w:rPr>
-          <w:sz w:val="26"/>
-          <w:szCs w:val="26"/>
-        </w:rPr>
-        <w:t>Bộ phận bảo mật thông tin.</w:t>
-      </w:r>
-    </w:p>
-    <w:p>
-      <w:pPr>
-        <w:rPr>
-          <w:sz w:val="26"/>
-          <w:szCs w:val="26"/>
-        </w:rPr>
-      </w:pPr>
-      <w:r>
-        <w:rPr>
-          <w:sz w:val="26"/>
-          <w:szCs w:val="26"/>
-        </w:rPr>
-        <w:t>2. Các bước thực hiện</w:t>
+          <w:numId w:val="10"/>
+        </w:numPr>
+        <w:rPr>
+          <w:sz w:val="26"/>
+          <w:szCs w:val="26"/>
+        </w:rPr>
+      </w:pPr>
+      <w:r>
+        <w:rPr>
+          <w:sz w:val="26"/>
+          <w:szCs w:val="26"/>
+        </w:rPr>
+        <w:t>Ngân hàng.</w:t>
+      </w:r>
+    </w:p>
+    <w:p>
+      <w:pPr>
+        <w:pStyle w:val="ListParagraph"/>
+        <w:numPr>
+          <w:ilvl w:val="0"/>
+          <w:numId w:val="10"/>
+        </w:numPr>
+        <w:rPr>
+          <w:sz w:val="26"/>
+          <w:szCs w:val="26"/>
+        </w:rPr>
+      </w:pPr>
+      <w:r>
+        <w:rPr>
+          <w:sz w:val="26"/>
+          <w:szCs w:val="26"/>
+        </w:rPr>
+        <w:t>Đơn vị thanh toán điện tử.</w:t>
+      </w:r>
+    </w:p>
+    <w:p>
+      <w:pPr>
+        <w:pStyle w:val="ListParagraph"/>
+        <w:numPr>
+          <w:ilvl w:val="0"/>
+          <w:numId w:val="10"/>
+        </w:numPr>
+        <w:rPr>
+          <w:sz w:val="26"/>
+          <w:szCs w:val="26"/>
+        </w:rPr>
+      </w:pPr>
+      <w:r>
+        <w:rPr>
+          <w:sz w:val="26"/>
+          <w:szCs w:val="26"/>
+        </w:rPr>
+        <w:t>Nền tảng giao hàng.</w:t>
+      </w:r>
+    </w:p>
+    <w:p>
+      <w:pPr>
+        <w:pStyle w:val="ListParagraph"/>
+        <w:numPr>
+          <w:ilvl w:val="0"/>
+          <w:numId w:val="10"/>
+        </w:numPr>
+        <w:rPr>
+          <w:sz w:val="26"/>
+          <w:szCs w:val="26"/>
+        </w:rPr>
+      </w:pPr>
+      <w:r>
+        <w:rPr>
+          <w:sz w:val="26"/>
+          <w:szCs w:val="26"/>
+        </w:rPr>
+        <w:t>Nhà cung cấp.</w:t>
+      </w:r>
+    </w:p>
+    <w:p>
+      <w:pPr>
+        <w:pStyle w:val="ListParagraph"/>
+        <w:numPr>
+          <w:ilvl w:val="0"/>
+          <w:numId w:val="10"/>
+        </w:numPr>
+        <w:rPr>
+          <w:sz w:val="26"/>
+          <w:szCs w:val="26"/>
+        </w:rPr>
+      </w:pPr>
+      <w:r>
+        <w:rPr>
+          <w:sz w:val="26"/>
+          <w:szCs w:val="26"/>
+        </w:rPr>
+        <w:t>Cơ quan thuế.</w:t>
+      </w:r>
+    </w:p>
+    <w:p>
+      <w:pPr>
+        <w:rPr>
+          <w:sz w:val="26"/>
+          <w:szCs w:val="26"/>
+        </w:rPr>
+      </w:pPr>
+      <w:r>
+        <w:rPr>
+          <w:sz w:val="26"/>
+          <w:szCs w:val="26"/>
+        </w:rPr>
+        <w:t xml:space="preserve">2. </w:t>
+      </w:r>
+      <w:r>
+        <w:rPr>
+          <w:sz w:val="26"/>
+          <w:szCs w:val="26"/>
+        </w:rPr>
+        <w:t>Các bước thực hiện</w:t>
       </w:r>
     </w:p>
     <w:p>
@@ -1051,764 +1890,6 @@
           <w:sz w:val="26"/>
           <w:szCs w:val="26"/>
         </w:rPr>
-        <w:t>Tiếp nhận nhu cầu hoặc yêu cầu hỗ trợ từ người sử dụng.</w:t>
-      </w:r>
-    </w:p>
-    <w:p>
-      <w:pPr>
-        <w:ind w:firstLine="720"/>
-        <w:rPr>
-          <w:sz w:val="26"/>
-          <w:szCs w:val="26"/>
-        </w:rPr>
-      </w:pPr>
-      <w:r>
-        <w:rPr>
-          <w:sz w:val="26"/>
-          <w:szCs w:val="26"/>
-        </w:rPr>
-        <w:t xml:space="preserve">S2: </w:t>
-      </w:r>
-      <w:r>
-        <w:rPr>
-          <w:sz w:val="26"/>
-          <w:szCs w:val="26"/>
-        </w:rPr>
-        <w:t>Ghi nhận yêu cầu trên hệ thống hỗ trợ.</w:t>
-      </w:r>
-    </w:p>
-    <w:p>
-      <w:pPr>
-        <w:ind w:firstLine="720"/>
-        <w:rPr>
-          <w:sz w:val="26"/>
-          <w:szCs w:val="26"/>
-        </w:rPr>
-      </w:pPr>
-      <w:r>
-        <w:rPr>
-          <w:sz w:val="26"/>
-          <w:szCs w:val="26"/>
-        </w:rPr>
-        <w:t xml:space="preserve">S3: </w:t>
-      </w:r>
-      <w:r>
-        <w:rPr>
-          <w:sz w:val="26"/>
-          <w:szCs w:val="26"/>
-        </w:rPr>
-        <w:t>Phân loại mức độ ảnh hưởng và mức độ ưu tiên.</w:t>
-      </w:r>
-    </w:p>
-    <w:p>
-      <w:pPr>
-        <w:ind w:firstLine="720"/>
-        <w:rPr>
-          <w:sz w:val="26"/>
-          <w:szCs w:val="26"/>
-        </w:rPr>
-      </w:pPr>
-      <w:r>
-        <w:rPr>
-          <w:sz w:val="26"/>
-          <w:szCs w:val="26"/>
-        </w:rPr>
-        <w:t xml:space="preserve">S4: </w:t>
-      </w:r>
-      <w:r>
-        <w:rPr>
-          <w:sz w:val="26"/>
-          <w:szCs w:val="26"/>
-        </w:rPr>
-        <w:t>Kiểm tra hệ thống POS, mạng, máy in, thiết bị hoặc phần mềm.</w:t>
-      </w:r>
-    </w:p>
-    <w:p>
-      <w:pPr>
-        <w:ind w:firstLine="720"/>
-        <w:rPr>
-          <w:sz w:val="26"/>
-          <w:szCs w:val="26"/>
-        </w:rPr>
-      </w:pPr>
-      <w:r>
-        <w:rPr>
-          <w:sz w:val="26"/>
-          <w:szCs w:val="26"/>
-        </w:rPr>
-        <w:t xml:space="preserve">S5: </w:t>
-      </w:r>
-      <w:r>
-        <w:rPr>
-          <w:sz w:val="26"/>
-          <w:szCs w:val="26"/>
-        </w:rPr>
-        <w:t>Xác định nguyên nhân sự cố.</w:t>
-      </w:r>
-    </w:p>
-    <w:p>
-      <w:pPr>
-        <w:ind w:firstLine="720"/>
-        <w:rPr>
-          <w:sz w:val="26"/>
-          <w:szCs w:val="26"/>
-        </w:rPr>
-      </w:pPr>
-      <w:r>
-        <w:rPr>
-          <w:sz w:val="26"/>
-          <w:szCs w:val="26"/>
-        </w:rPr>
-        <w:t xml:space="preserve">S6: </w:t>
-      </w:r>
-      <w:r>
-        <w:rPr>
-          <w:sz w:val="26"/>
-          <w:szCs w:val="26"/>
-        </w:rPr>
-        <w:t>Thực hiện sửa chữa, cấu hình hoặc thay thế thiết bị.</w:t>
-      </w:r>
-    </w:p>
-    <w:p>
-      <w:pPr>
-        <w:ind w:firstLine="720"/>
-        <w:rPr>
-          <w:sz w:val="26"/>
-          <w:szCs w:val="26"/>
-        </w:rPr>
-      </w:pPr>
-      <w:r>
-        <w:rPr>
-          <w:sz w:val="26"/>
-          <w:szCs w:val="26"/>
-        </w:rPr>
-        <w:t xml:space="preserve">S7: </w:t>
-      </w:r>
-      <w:r>
-        <w:rPr>
-          <w:sz w:val="26"/>
-          <w:szCs w:val="26"/>
-        </w:rPr>
-        <w:t>Kiểm tra hệ thống sau khi xử lý.</w:t>
-      </w:r>
-    </w:p>
-    <w:p>
-      <w:pPr>
-        <w:ind w:firstLine="720"/>
-        <w:rPr>
-          <w:sz w:val="26"/>
-          <w:szCs w:val="26"/>
-        </w:rPr>
-      </w:pPr>
-      <w:r>
-        <w:rPr>
-          <w:sz w:val="26"/>
-          <w:szCs w:val="26"/>
-        </w:rPr>
-        <w:lastRenderedPageBreak/>
-        <w:t xml:space="preserve">S8: </w:t>
-      </w:r>
-      <w:r>
-        <w:rPr>
-          <w:sz w:val="26"/>
-          <w:szCs w:val="26"/>
-        </w:rPr>
-        <w:t>Người sử dụng xác nhận hệ thống hoạt động bình thường.</w:t>
-      </w:r>
-    </w:p>
-    <w:p>
-      <w:pPr>
-        <w:ind w:firstLine="720"/>
-        <w:rPr>
-          <w:sz w:val="26"/>
-          <w:szCs w:val="26"/>
-        </w:rPr>
-      </w:pPr>
-      <w:r>
-        <w:rPr>
-          <w:sz w:val="26"/>
-          <w:szCs w:val="26"/>
-        </w:rPr>
-        <w:t xml:space="preserve">S9: </w:t>
-      </w:r>
-      <w:r>
-        <w:rPr>
-          <w:sz w:val="26"/>
-          <w:szCs w:val="26"/>
-        </w:rPr>
-        <w:t>Đóng yêu cầu và lưu lại lịch sử xử lý.</w:t>
-      </w:r>
-    </w:p>
-    <w:p>
-      <w:pPr>
-        <w:ind w:firstLine="720"/>
-        <w:rPr>
-          <w:sz w:val="26"/>
-          <w:szCs w:val="26"/>
-        </w:rPr>
-      </w:pPr>
-      <w:r>
-        <w:rPr>
-          <w:sz w:val="26"/>
-          <w:szCs w:val="26"/>
-        </w:rPr>
-        <w:t xml:space="preserve">S10: </w:t>
-      </w:r>
-      <w:r>
-        <w:rPr>
-          <w:sz w:val="26"/>
-          <w:szCs w:val="26"/>
-        </w:rPr>
-        <w:t>Phân tích sự cố để đề xuất biện pháp phòng ngừa.</w:t>
-      </w:r>
-    </w:p>
-    <w:p>
-      <w:pPr>
-        <w:ind w:firstLine="720"/>
-        <w:rPr>
-          <w:sz w:val="26"/>
-          <w:szCs w:val="26"/>
-        </w:rPr>
-      </w:pPr>
-      <w:r>
-        <w:rPr>
-          <w:sz w:val="26"/>
-          <w:szCs w:val="26"/>
-        </w:rPr>
-        <w:t xml:space="preserve">S11: </w:t>
-      </w:r>
-      <w:r>
-        <w:rPr>
-          <w:sz w:val="26"/>
-          <w:szCs w:val="26"/>
-        </w:rPr>
-        <w:t>Thực hiện sao lưu, cập nhật và bảo vệ dữ liệu định kỳ.</w:t>
-      </w:r>
-    </w:p>
-    <w:p>
-      <w:pPr>
-        <w:rPr>
-          <w:sz w:val="26"/>
-          <w:szCs w:val="26"/>
-        </w:rPr>
-      </w:pPr>
-      <w:r>
-        <w:rPr>
-          <w:sz w:val="26"/>
-          <w:szCs w:val="26"/>
-        </w:rPr>
-        <w:t>3. Đối tượng khách hàng</w:t>
-      </w:r>
-    </w:p>
-    <w:p>
-      <w:pPr>
-        <w:pStyle w:val="ListParagraph"/>
-        <w:numPr>
-          <w:ilvl w:val="0"/>
-          <w:numId w:val="7"/>
-        </w:numPr>
-        <w:rPr>
-          <w:sz w:val="26"/>
-          <w:szCs w:val="26"/>
-        </w:rPr>
-      </w:pPr>
-      <w:r>
-        <w:rPr>
-          <w:sz w:val="26"/>
-          <w:szCs w:val="26"/>
-        </w:rPr>
-        <w:t>Nhân viên và quản lý cửa hàng.</w:t>
-      </w:r>
-    </w:p>
-    <w:p>
-      <w:pPr>
-        <w:pStyle w:val="ListParagraph"/>
-        <w:numPr>
-          <w:ilvl w:val="0"/>
-          <w:numId w:val="7"/>
-        </w:numPr>
-        <w:rPr>
-          <w:sz w:val="26"/>
-          <w:szCs w:val="26"/>
-        </w:rPr>
-      </w:pPr>
-      <w:r>
-        <w:rPr>
-          <w:sz w:val="26"/>
-          <w:szCs w:val="26"/>
-        </w:rPr>
-        <w:t>Các phòng ban.</w:t>
-      </w:r>
-    </w:p>
-    <w:p>
-      <w:pPr>
-        <w:pStyle w:val="ListParagraph"/>
-        <w:numPr>
-          <w:ilvl w:val="0"/>
-          <w:numId w:val="7"/>
-        </w:numPr>
-        <w:rPr>
-          <w:sz w:val="26"/>
-          <w:szCs w:val="26"/>
-        </w:rPr>
-      </w:pPr>
-      <w:r>
-        <w:rPr>
-          <w:sz w:val="26"/>
-          <w:szCs w:val="26"/>
-        </w:rPr>
-        <w:t>Khách hàng sử dụng website hoặc ứng dụng.</w:t>
-      </w:r>
-    </w:p>
-    <w:p>
-      <w:pPr>
-        <w:pStyle w:val="ListParagraph"/>
-        <w:numPr>
-          <w:ilvl w:val="0"/>
-          <w:numId w:val="7"/>
-        </w:numPr>
-        <w:rPr>
-          <w:sz w:val="26"/>
-          <w:szCs w:val="26"/>
-        </w:rPr>
-      </w:pPr>
-      <w:r>
-        <w:rPr>
-          <w:sz w:val="26"/>
-          <w:szCs w:val="26"/>
-        </w:rPr>
-        <w:t>Ban lãnh đạo cần dữ liệu báo cáo.</w:t>
-      </w:r>
-    </w:p>
-    <w:p>
-      <w:pPr>
-        <w:rPr>
-          <w:sz w:val="26"/>
-          <w:szCs w:val="26"/>
-        </w:rPr>
-      </w:pPr>
-      <w:r>
-        <w:rPr>
-          <w:sz w:val="26"/>
-          <w:szCs w:val="26"/>
-        </w:rPr>
-        <w:t>4. Các kết quả có thể xảy ra</w:t>
-      </w:r>
-    </w:p>
-    <w:p>
-      <w:pPr>
-        <w:pStyle w:val="ListParagraph"/>
-        <w:numPr>
-          <w:ilvl w:val="0"/>
-          <w:numId w:val="8"/>
-        </w:numPr>
-        <w:rPr>
-          <w:sz w:val="26"/>
-          <w:szCs w:val="26"/>
-        </w:rPr>
-      </w:pPr>
-      <w:r>
-        <w:rPr>
-          <w:sz w:val="26"/>
-          <w:szCs w:val="26"/>
-        </w:rPr>
-        <w:t>Sự cố được xử lý hoàn toàn.</w:t>
-      </w:r>
-    </w:p>
-    <w:p>
-      <w:pPr>
-        <w:pStyle w:val="ListParagraph"/>
-        <w:numPr>
-          <w:ilvl w:val="0"/>
-          <w:numId w:val="8"/>
-        </w:numPr>
-        <w:rPr>
-          <w:sz w:val="26"/>
-          <w:szCs w:val="26"/>
-        </w:rPr>
-      </w:pPr>
-      <w:r>
-        <w:rPr>
-          <w:sz w:val="26"/>
-          <w:szCs w:val="26"/>
-        </w:rPr>
-        <w:t>Hệ thống được khôi phục tạm thời.</w:t>
-      </w:r>
-    </w:p>
-    <w:p>
-      <w:pPr>
-        <w:pStyle w:val="ListParagraph"/>
-        <w:numPr>
-          <w:ilvl w:val="0"/>
-          <w:numId w:val="8"/>
-        </w:numPr>
-        <w:rPr>
-          <w:sz w:val="26"/>
-          <w:szCs w:val="26"/>
-        </w:rPr>
-      </w:pPr>
-      <w:r>
-        <w:rPr>
-          <w:sz w:val="26"/>
-          <w:szCs w:val="26"/>
-        </w:rPr>
-        <w:t>Thiết bị cần được thay thế.</w:t>
-      </w:r>
-    </w:p>
-    <w:p>
-      <w:pPr>
-        <w:pStyle w:val="ListParagraph"/>
-        <w:numPr>
-          <w:ilvl w:val="0"/>
-          <w:numId w:val="8"/>
-        </w:numPr>
-        <w:rPr>
-          <w:sz w:val="26"/>
-          <w:szCs w:val="26"/>
-        </w:rPr>
-      </w:pPr>
-      <w:r>
-        <w:rPr>
-          <w:sz w:val="26"/>
-          <w:szCs w:val="26"/>
-        </w:rPr>
-        <w:t>Sự cố được chuyển cho nhà cung cấp xử lý.</w:t>
-      </w:r>
-    </w:p>
-    <w:p>
-      <w:pPr>
-        <w:pStyle w:val="ListParagraph"/>
-        <w:numPr>
-          <w:ilvl w:val="0"/>
-          <w:numId w:val="8"/>
-        </w:numPr>
-        <w:rPr>
-          <w:sz w:val="26"/>
-          <w:szCs w:val="26"/>
-        </w:rPr>
-      </w:pPr>
-      <w:r>
-        <w:rPr>
-          <w:sz w:val="26"/>
-          <w:szCs w:val="26"/>
-        </w:rPr>
-        <w:t>Hệ thống tiếp tục gián đoạn.</w:t>
-      </w:r>
-    </w:p>
-    <w:p>
-      <w:pPr>
-        <w:pStyle w:val="ListParagraph"/>
-        <w:numPr>
-          <w:ilvl w:val="0"/>
-          <w:numId w:val="8"/>
-        </w:numPr>
-        <w:rPr>
-          <w:sz w:val="26"/>
-          <w:szCs w:val="26"/>
-        </w:rPr>
-      </w:pPr>
-      <w:r>
-        <w:rPr>
-          <w:sz w:val="26"/>
-          <w:szCs w:val="26"/>
-        </w:rPr>
-        <w:t>Dữ liệu được khôi phục hoặc có nguy cơ bị mất.</w:t>
-      </w:r>
-    </w:p>
-    <w:p>
-      <w:pPr>
-        <w:pStyle w:val="ListParagraph"/>
-        <w:numPr>
-          <w:ilvl w:val="0"/>
-          <w:numId w:val="8"/>
-        </w:numPr>
-        <w:rPr>
-          <w:sz w:val="26"/>
-          <w:szCs w:val="26"/>
-        </w:rPr>
-      </w:pPr>
-      <w:r>
-        <w:rPr>
-          <w:sz w:val="26"/>
-          <w:szCs w:val="26"/>
-        </w:rPr>
-        <w:t>Yêu cầu cải tiến hệ thống được phê duyệt.</w:t>
-      </w:r>
-    </w:p>
-    <w:p>
-      <w:pPr>
-        <w:rPr>
-          <w:sz w:val="26"/>
-          <w:szCs w:val="26"/>
-        </w:rPr>
-      </w:pPr>
-    </w:p>
-    <w:p>
-      <w:pPr>
-        <w:rPr>
-          <w:b/>
-          <w:bCs/>
-          <w:sz w:val="26"/>
-          <w:szCs w:val="26"/>
-        </w:rPr>
-      </w:pPr>
-      <w:r>
-        <w:rPr>
-          <w:b/>
-          <w:bCs/>
-          <w:sz w:val="26"/>
-          <w:szCs w:val="26"/>
-        </w:rPr>
-        <w:t xml:space="preserve">III. </w:t>
-      </w:r>
-      <w:r>
-        <w:rPr>
-          <w:b/>
-          <w:bCs/>
-          <w:sz w:val="26"/>
-          <w:szCs w:val="26"/>
-        </w:rPr>
-        <w:t>Quản lý tài chính, kế toán và đối soát doanh thu</w:t>
-      </w:r>
-    </w:p>
-    <w:p>
-      <w:pPr>
-        <w:rPr>
-          <w:sz w:val="26"/>
-          <w:szCs w:val="26"/>
-        </w:rPr>
-      </w:pPr>
-      <w:r>
-        <w:rPr>
-          <w:sz w:val="26"/>
-          <w:szCs w:val="26"/>
-        </w:rPr>
-        <w:t>1. Tác nhân</w:t>
-      </w:r>
-    </w:p>
-    <w:p>
-      <w:pPr>
-        <w:pStyle w:val="ListParagraph"/>
-        <w:numPr>
-          <w:ilvl w:val="0"/>
-          <w:numId w:val="10"/>
-        </w:numPr>
-        <w:rPr>
-          <w:sz w:val="26"/>
-          <w:szCs w:val="26"/>
-        </w:rPr>
-      </w:pPr>
-      <w:r>
-        <w:rPr>
-          <w:sz w:val="26"/>
-          <w:szCs w:val="26"/>
-        </w:rPr>
-        <w:t>Nhân viên thu ngân.</w:t>
-      </w:r>
-    </w:p>
-    <w:p>
-      <w:pPr>
-        <w:pStyle w:val="ListParagraph"/>
-        <w:numPr>
-          <w:ilvl w:val="0"/>
-          <w:numId w:val="10"/>
-        </w:numPr>
-        <w:rPr>
-          <w:sz w:val="26"/>
-          <w:szCs w:val="26"/>
-        </w:rPr>
-      </w:pPr>
-      <w:r>
-        <w:rPr>
-          <w:sz w:val="26"/>
-          <w:szCs w:val="26"/>
-        </w:rPr>
-        <w:t>Quản lý cửa hàng.</w:t>
-      </w:r>
-    </w:p>
-    <w:p>
-      <w:pPr>
-        <w:pStyle w:val="ListParagraph"/>
-        <w:numPr>
-          <w:ilvl w:val="0"/>
-          <w:numId w:val="10"/>
-        </w:numPr>
-        <w:rPr>
-          <w:sz w:val="26"/>
-          <w:szCs w:val="26"/>
-        </w:rPr>
-      </w:pPr>
-      <w:r>
-        <w:rPr>
-          <w:sz w:val="26"/>
-          <w:szCs w:val="26"/>
-        </w:rPr>
-        <w:t>Bộ phận kế toán.</w:t>
-      </w:r>
-    </w:p>
-    <w:p>
-      <w:pPr>
-        <w:pStyle w:val="ListParagraph"/>
-        <w:numPr>
-          <w:ilvl w:val="0"/>
-          <w:numId w:val="10"/>
-        </w:numPr>
-        <w:rPr>
-          <w:sz w:val="26"/>
-          <w:szCs w:val="26"/>
-        </w:rPr>
-      </w:pPr>
-      <w:r>
-        <w:rPr>
-          <w:sz w:val="26"/>
-          <w:szCs w:val="26"/>
-        </w:rPr>
-        <w:t>Bộ phận tài chính.</w:t>
-      </w:r>
-    </w:p>
-    <w:p>
-      <w:pPr>
-        <w:pStyle w:val="ListParagraph"/>
-        <w:numPr>
-          <w:ilvl w:val="0"/>
-          <w:numId w:val="10"/>
-        </w:numPr>
-        <w:rPr>
-          <w:sz w:val="26"/>
-          <w:szCs w:val="26"/>
-        </w:rPr>
-      </w:pPr>
-      <w:r>
-        <w:rPr>
-          <w:sz w:val="26"/>
-          <w:szCs w:val="26"/>
-        </w:rPr>
-        <w:t>Ngân hàng.</w:t>
-      </w:r>
-    </w:p>
-    <w:p>
-      <w:pPr>
-        <w:pStyle w:val="ListParagraph"/>
-        <w:numPr>
-          <w:ilvl w:val="0"/>
-          <w:numId w:val="10"/>
-        </w:numPr>
-        <w:rPr>
-          <w:sz w:val="26"/>
-          <w:szCs w:val="26"/>
-        </w:rPr>
-      </w:pPr>
-      <w:r>
-        <w:rPr>
-          <w:sz w:val="26"/>
-          <w:szCs w:val="26"/>
-        </w:rPr>
-        <w:t>Đơn vị thanh toán điện tử.</w:t>
-      </w:r>
-    </w:p>
-    <w:p>
-      <w:pPr>
-        <w:pStyle w:val="ListParagraph"/>
-        <w:numPr>
-          <w:ilvl w:val="0"/>
-          <w:numId w:val="10"/>
-        </w:numPr>
-        <w:rPr>
-          <w:sz w:val="26"/>
-          <w:szCs w:val="26"/>
-        </w:rPr>
-      </w:pPr>
-      <w:r>
-        <w:rPr>
-          <w:sz w:val="26"/>
-          <w:szCs w:val="26"/>
-        </w:rPr>
-        <w:t>Nền tảng giao hàng.</w:t>
-      </w:r>
-    </w:p>
-    <w:p>
-      <w:pPr>
-        <w:pStyle w:val="ListParagraph"/>
-        <w:numPr>
-          <w:ilvl w:val="0"/>
-          <w:numId w:val="10"/>
-        </w:numPr>
-        <w:rPr>
-          <w:sz w:val="26"/>
-          <w:szCs w:val="26"/>
-        </w:rPr>
-      </w:pPr>
-      <w:r>
-        <w:rPr>
-          <w:sz w:val="26"/>
-          <w:szCs w:val="26"/>
-        </w:rPr>
-        <w:t>Nhà cung cấp.</w:t>
-      </w:r>
-    </w:p>
-    <w:p>
-      <w:pPr>
-        <w:pStyle w:val="ListParagraph"/>
-        <w:numPr>
-          <w:ilvl w:val="0"/>
-          <w:numId w:val="10"/>
-        </w:numPr>
-        <w:rPr>
-          <w:sz w:val="26"/>
-          <w:szCs w:val="26"/>
-        </w:rPr>
-      </w:pPr>
-      <w:r>
-        <w:rPr>
-          <w:sz w:val="26"/>
-          <w:szCs w:val="26"/>
-        </w:rPr>
-        <w:t>Cơ quan thuế.</w:t>
-      </w:r>
-    </w:p>
-    <w:p>
-      <w:pPr>
-        <w:rPr>
-          <w:sz w:val="26"/>
-          <w:szCs w:val="26"/>
-        </w:rPr>
-      </w:pPr>
-      <w:r>
-        <w:rPr>
-          <w:sz w:val="26"/>
-          <w:szCs w:val="26"/>
-        </w:rPr>
-        <w:lastRenderedPageBreak/>
-        <w:t xml:space="preserve">2. </w:t>
-      </w:r>
-      <w:r>
-        <w:rPr>
-          <w:sz w:val="26"/>
-          <w:szCs w:val="26"/>
-        </w:rPr>
-        <w:t>Các bước thực hiện</w:t>
-      </w:r>
-    </w:p>
-    <w:p>
-      <w:pPr>
-        <w:rPr>
-          <w:sz w:val="26"/>
-          <w:szCs w:val="26"/>
-        </w:rPr>
-      </w:pPr>
-      <w:r>
-        <w:rPr>
-          <w:sz w:val="26"/>
-          <w:szCs w:val="26"/>
-        </w:rPr>
-        <w:tab/>
-        <w:t xml:space="preserve">S1: </w:t>
-      </w:r>
-      <w:r>
-        <w:rPr>
-          <w:sz w:val="26"/>
-          <w:szCs w:val="26"/>
-        </w:rPr>
         <w:t>Hệ thống ghi nhận các giao dịch bán hàng.</w:t>
       </w:r>
     </w:p>
@@ -2039,6 +2120,7 @@
           <w:sz w:val="26"/>
           <w:szCs w:val="26"/>
         </w:rPr>
+        <w:lastRenderedPageBreak/>
         <w:t xml:space="preserve">S11: </w:t>
       </w:r>
       <w:r>
@@ -2074,6 +2156,56 @@
     </w:p>
     <w:p>
       <w:pPr>
+        <w:ind w:firstLine="720"/>
+        <w:rPr>
+          <w:sz w:val="26"/>
+          <w:szCs w:val="26"/>
+        </w:rPr>
+      </w:pPr>
+      <w:r>
+        <w:rPr>
+          <w:sz w:val="26"/>
+          <w:szCs w:val="26"/>
+        </w:rPr>
+        <w:drawing>
+          <wp:inline distT="0" distB="0" distL="0" distR="0" wp14:anchorId="0185649B" wp14:editId="5AADC294">
+            <wp:extent cx="5943600" cy="1691640"/>
+            <wp:effectExtent l="0" t="0" r="0" b="3810"/>
+            <wp:docPr id="1985324107" name="Picture 1"/>
+            <wp:cNvGraphicFramePr>
+              <a:graphicFrameLocks xmlns:a="http://schemas.openxmlformats.org/drawingml/2006/main" noChangeAspect="1"/>
+            </wp:cNvGraphicFramePr>
+            <a:graphic xmlns:a="http://schemas.openxmlformats.org/drawingml/2006/main">
+              <a:graphicData uri="http://schemas.openxmlformats.org/drawingml/2006/picture">
+                <pic:pic xmlns:pic="http://schemas.openxmlformats.org/drawingml/2006/picture">
+                  <pic:nvPicPr>
+                    <pic:cNvPr id="1985324107" name=""/>
+                    <pic:cNvPicPr/>
+                  </pic:nvPicPr>
+                  <pic:blipFill>
+                    <a:blip r:embed="rId7"/>
+                    <a:stretch>
+                      <a:fillRect/>
+                    </a:stretch>
+                  </pic:blipFill>
+                  <pic:spPr>
+                    <a:xfrm>
+                      <a:off x="0" y="0"/>
+                      <a:ext cx="5943600" cy="1691640"/>
+                    </a:xfrm>
+                    <a:prstGeom prst="rect">
+                      <a:avLst/>
+                    </a:prstGeom>
+                  </pic:spPr>
+                </pic:pic>
+              </a:graphicData>
+            </a:graphic>
+          </wp:inline>
+        </w:drawing>
+      </w:r>
+    </w:p>
+    <w:p>
+      <w:pPr>
         <w:rPr>
           <w:sz w:val="26"/>
           <w:szCs w:val="26"/>
@@ -2359,7 +2491,6 @@
           <w:sz w:val="26"/>
           <w:szCs w:val="26"/>
         </w:rPr>
-        <w:lastRenderedPageBreak/>
         <w:t>Phát hiện giao dịch bất thường hoặc sai phạm.</w:t>
       </w:r>
     </w:p>
@@ -4382,6 +4513,7 @@
   <w:style w:type="character" w:default="1" w:styleId="DefaultParagraphFont">
     <w:name w:val="Default Paragraph Font"/>
     <w:uiPriority w:val="1"/>
+    <w:semiHidden/>
     <w:unhideWhenUsed/>
   </w:style>
   <w:style w:type="table" w:default="1" w:styleId="TableNormal">

</xml_diff>